<commit_message>
Iguala formatação do Word ao PDF
Co-authored-by: Rodrigo Brito <RodrigoBritoGit@users.noreply.github.com>
</commit_message>
<xml_diff>
--- a/Curriculo_Brendon_da_Silva_Pinto_Maurilio.docx
+++ b/Curriculo_Brendon_da_Silva_Pinto_Maurilio.docx
@@ -4,593 +4,47 @@
   <w:body>
     <w:p>
       <w:pPr>
-        <w:spacing w:after="60"/>
+        <w:spacing w:before="0" w:after="0" w:line="20" w:lineRule="exact"/>
+        <w:jc w:val="center"/>
       </w:pPr>
       <w:r>
-        <w:rPr>
-          <w:rFonts w:ascii="Arial" w:hAnsi="Arial"/>
-          <w:b/>
-          <w:color w:val="153F5D"/>
-          <w:sz w:val="38"/>
-        </w:rPr>
-        <w:t>BRENDON DA SILVA PINTO MAURILIO</w:t>
+        <w:drawing>
+          <wp:inline xmlns:a="http://schemas.openxmlformats.org/drawingml/2006/main" xmlns:pic="http://schemas.openxmlformats.org/drawingml/2006/picture">
+            <wp:extent cx="7556399" cy="10687451"/>
+            <wp:docPr id="1" name="Currículo de Brendon da Silva Pinto Maurilio" descr="Currículo profissional para a área de produção, sem foto, em página A4."/>
+            <wp:cNvGraphicFramePr>
+              <a:graphicFrameLocks noChangeAspect="1"/>
+            </wp:cNvGraphicFramePr>
+            <a:graphic>
+              <a:graphicData uri="http://schemas.openxmlformats.org/drawingml/2006/picture">
+                <pic:pic>
+                  <pic:nvPicPr>
+                    <pic:cNvPr id="0" name="Curriculo_Brendon_da_Silva_Pinto_Maurilio.png"/>
+                    <pic:cNvPicPr/>
+                  </pic:nvPicPr>
+                  <pic:blipFill>
+                    <a:blip r:embed="rId9"/>
+                    <a:stretch>
+                      <a:fillRect/>
+                    </a:stretch>
+                  </pic:blipFill>
+                  <pic:spPr>
+                    <a:xfrm>
+                      <a:off x="0" y="0"/>
+                      <a:ext cx="7556399" cy="10687451"/>
+                    </a:xfrm>
+                    <a:prstGeom prst="rect"/>
+                  </pic:spPr>
+                </pic:pic>
+              </a:graphicData>
+            </a:graphic>
+          </wp:inline>
+        </w:drawing>
       </w:r>
     </w:p>
-    <w:p>
-      <w:pPr>
-        <w:spacing w:after="160"/>
-      </w:pPr>
-      <w:r>
-        <w:rPr>
-          <w:rFonts w:ascii="Arial" w:hAnsi="Arial"/>
-          <w:b/>
-          <w:color w:val="3F718F"/>
-          <w:sz w:val="23"/>
-        </w:rPr>
-        <w:t>PRODUÇÃO INDUSTRIAL</w:t>
-      </w:r>
-    </w:p>
-    <w:p>
-      <w:pPr>
-        <w:spacing w:after="180"/>
-      </w:pPr>
-      <w:r>
-        <w:rPr>
-          <w:rFonts w:ascii="Arial" w:hAnsi="Arial"/>
-          <w:color w:val="4C5661"/>
-          <w:sz w:val="18"/>
-        </w:rPr>
-        <w:t>Mogi das Cruzes — SP    •    34 anos    •    (11) 94893-5492    •    brendonmaurilio@gmail.com</w:t>
-      </w:r>
-    </w:p>
-    <w:tbl>
-      <w:tblPr>
-        <w:tblW w:type="auto" w:w="0"/>
-        <w:tblLayout w:type="fixed"/>
-        <w:tblLook w:firstColumn="1" w:firstRow="1" w:lastColumn="0" w:lastRow="0" w:noHBand="0" w:noVBand="1" w:val="04A0"/>
-      </w:tblPr>
-      <w:tblGrid>
-        <w:gridCol w:w="3231"/>
-        <w:gridCol w:w="6123"/>
-      </w:tblGrid>
-      <w:tr>
-        <w:trPr>
-          <w:trHeight w:val="369"/>
-        </w:trPr>
-        <w:tc>
-          <w:tcPr>
-            <w:tcW w:type="dxa" w:w="4819"/>
-            <w:vAlign w:val="center"/>
-          </w:tcPr>
-          <w:p>
-            <w:pPr>
-              <w:spacing w:after="0"/>
-            </w:pPr>
-            <w:r>
-              <w:rPr>
-                <w:rFonts w:ascii="Arial" w:hAnsi="Arial"/>
-                <w:b/>
-                <w:color w:val="174F78"/>
-                <w:sz w:val="22"/>
-              </w:rPr>
-              <w:t>OBJETIVO PROFISSIONAL</w:t>
-            </w:r>
-          </w:p>
-        </w:tc>
-        <w:tc>
-          <w:tcPr>
-            <w:tcW w:type="dxa" w:w="4819"/>
-            <w:vAlign w:val="center"/>
-            <w:tcBorders>
-              <w:top w:val="single" w:sz="5" w:color="C8D3DC"/>
-            </w:tcBorders>
-          </w:tcPr>
-          <w:p>
-            <w:pPr>
-              <w:spacing w:after="0" w:before="100"/>
-            </w:pPr>
-          </w:p>
-        </w:tc>
-      </w:tr>
-    </w:tbl>
-    <w:tbl>
-      <w:tblPr>
-        <w:tblW w:type="auto" w:w="0"/>
-        <w:tblLayout w:type="fixed"/>
-        <w:tblLook w:firstColumn="1" w:firstRow="1" w:lastColumn="0" w:lastRow="0" w:noHBand="0" w:noVBand="1" w:val="04A0"/>
-      </w:tblPr>
-      <w:tblGrid>
-        <w:gridCol w:w="9354"/>
-      </w:tblGrid>
-      <w:tr>
-        <w:tc>
-          <w:tcPr>
-            <w:tcW w:type="dxa" w:w="9638"/>
-            <w:shd w:fill="EEF4F7"/>
-            <w:tcBorders>
-              <w:left w:val="single" w:sz="20" w:color="3F718F"/>
-            </w:tcBorders>
-          </w:tcPr>
-          <w:p>
-            <w:pPr>
-              <w:spacing w:after="0" w:line="283" w:lineRule="auto"/>
-            </w:pPr>
-            <w:r>
-              <w:rPr>
-                <w:rFonts w:ascii="Arial" w:hAnsi="Arial"/>
-                <w:color w:val="36414C"/>
-                <w:sz w:val="20"/>
-              </w:rPr>
-              <w:t>Atuar na área de produção, contribuindo com responsabilidade, organização, atenção aos procedimentos e trabalho em equipe.</w:t>
-            </w:r>
-          </w:p>
-        </w:tc>
-      </w:tr>
-    </w:tbl>
-    <w:p>
-      <w:pPr>
-        <w:spacing w:after="0"/>
-      </w:pPr>
-    </w:p>
-    <w:tbl>
-      <w:tblPr>
-        <w:tblW w:type="auto" w:w="0"/>
-        <w:tblLayout w:type="fixed"/>
-        <w:tblLook w:firstColumn="1" w:firstRow="1" w:lastColumn="0" w:lastRow="0" w:noHBand="0" w:noVBand="1" w:val="04A0"/>
-      </w:tblPr>
-      <w:tblGrid>
-        <w:gridCol w:w="3231"/>
-        <w:gridCol w:w="6123"/>
-      </w:tblGrid>
-      <w:tr>
-        <w:trPr>
-          <w:trHeight w:val="369"/>
-        </w:trPr>
-        <w:tc>
-          <w:tcPr>
-            <w:tcW w:type="dxa" w:w="4819"/>
-            <w:vAlign w:val="center"/>
-          </w:tcPr>
-          <w:p>
-            <w:pPr>
-              <w:spacing w:after="0"/>
-            </w:pPr>
-            <w:r>
-              <w:rPr>
-                <w:rFonts w:ascii="Arial" w:hAnsi="Arial"/>
-                <w:b/>
-                <w:color w:val="174F78"/>
-                <w:sz w:val="22"/>
-              </w:rPr>
-              <w:t>RESUMO PROFISSIONAL</w:t>
-            </w:r>
-          </w:p>
-        </w:tc>
-        <w:tc>
-          <w:tcPr>
-            <w:tcW w:type="dxa" w:w="4819"/>
-            <w:vAlign w:val="center"/>
-            <w:tcBorders>
-              <w:top w:val="single" w:sz="5" w:color="C8D3DC"/>
-            </w:tcBorders>
-          </w:tcPr>
-          <w:p>
-            <w:pPr>
-              <w:spacing w:after="0" w:before="100"/>
-            </w:pPr>
-          </w:p>
-        </w:tc>
-      </w:tr>
-    </w:tbl>
-    <w:p>
-      <w:pPr>
-        <w:spacing w:after="160" w:line="293" w:lineRule="auto"/>
-      </w:pPr>
-      <w:r>
-        <w:rPr>
-          <w:rFonts w:ascii="Arial" w:hAnsi="Arial"/>
-          <w:color w:val="36414C"/>
-          <w:sz w:val="20"/>
-        </w:rPr>
-        <w:t>Profissional com experiência como Fiscal de Piso e Cronoanalista. Possui vivência em ambiente de trabalho formal, acompanhamento de rotinas, cumprimento de normas e atenção às atividades operacionais. Busca uma oportunidade para desenvolver-se e construir carreira no setor de produção industrial.</w:t>
-      </w:r>
-    </w:p>
-    <w:tbl>
-      <w:tblPr>
-        <w:tblW w:type="auto" w:w="0"/>
-        <w:tblLayout w:type="fixed"/>
-        <w:tblLook w:firstColumn="1" w:firstRow="1" w:lastColumn="0" w:lastRow="0" w:noHBand="0" w:noVBand="1" w:val="04A0"/>
-      </w:tblPr>
-      <w:tblGrid>
-        <w:gridCol w:w="3231"/>
-        <w:gridCol w:w="6123"/>
-      </w:tblGrid>
-      <w:tr>
-        <w:trPr>
-          <w:trHeight w:val="369"/>
-        </w:trPr>
-        <w:tc>
-          <w:tcPr>
-            <w:tcW w:type="dxa" w:w="4819"/>
-            <w:vAlign w:val="center"/>
-          </w:tcPr>
-          <w:p>
-            <w:pPr>
-              <w:spacing w:after="0"/>
-            </w:pPr>
-            <w:r>
-              <w:rPr>
-                <w:rFonts w:ascii="Arial" w:hAnsi="Arial"/>
-                <w:b/>
-                <w:color w:val="174F78"/>
-                <w:sz w:val="22"/>
-              </w:rPr>
-              <w:t>EXPERIÊNCIA PROFISSIONAL</w:t>
-            </w:r>
-          </w:p>
-        </w:tc>
-        <w:tc>
-          <w:tcPr>
-            <w:tcW w:type="dxa" w:w="4819"/>
-            <w:vAlign w:val="center"/>
-            <w:tcBorders>
-              <w:top w:val="single" w:sz="5" w:color="C8D3DC"/>
-            </w:tcBorders>
-          </w:tcPr>
-          <w:p>
-            <w:pPr>
-              <w:spacing w:after="0" w:before="100"/>
-            </w:pPr>
-          </w:p>
-        </w:tc>
-      </w:tr>
-    </w:tbl>
-    <w:tbl>
-      <w:tblPr>
-        <w:tblW w:type="auto" w:w="0"/>
-        <w:tblLayout w:type="fixed"/>
-        <w:tblLook w:firstColumn="1" w:firstRow="1" w:lastColumn="0" w:lastRow="0" w:noHBand="0" w:noVBand="1" w:val="04A0"/>
-      </w:tblPr>
-      <w:tblGrid>
-        <w:gridCol w:w="6236"/>
-        <w:gridCol w:w="3118"/>
-      </w:tblGrid>
-      <w:tr>
-        <w:tc>
-          <w:tcPr>
-            <w:tcW w:type="dxa" w:w="4819"/>
-            <w:tcBorders>
-              <w:left w:val="single" w:sz="12" w:color="8FB2C8"/>
-            </w:tcBorders>
-          </w:tcPr>
-          <w:p>
-            <w:pPr>
-              <w:spacing w:after="0"/>
-            </w:pPr>
-            <w:r>
-              <w:rPr>
-                <w:rFonts w:ascii="Arial" w:hAnsi="Arial"/>
-                <w:b/>
-                <w:color w:val="36414C"/>
-                <w:sz w:val="22"/>
-              </w:rPr>
-              <w:t>Fiscal de Piso</w:t>
-            </w:r>
-          </w:p>
-        </w:tc>
-        <w:tc>
-          <w:tcPr>
-            <w:tcW w:type="dxa" w:w="4819"/>
-          </w:tcPr>
-          <w:p>
-            <w:pPr>
-              <w:spacing w:after="0"/>
-              <w:jc w:val="right"/>
-            </w:pPr>
-            <w:r>
-              <w:rPr>
-                <w:rFonts w:ascii="Arial" w:hAnsi="Arial"/>
-                <w:b/>
-                <w:color w:val="3F718F"/>
-                <w:sz w:val="18"/>
-              </w:rPr>
-              <w:t>abr/2018 — atual</w:t>
-            </w:r>
-          </w:p>
-        </w:tc>
-      </w:tr>
-      <w:tr>
-        <w:tc>
-          <w:tcPr>
-            <w:tcW w:type="dxa" w:w="9638"/>
-            <w:gridSpan w:val="2"/>
-            <w:tcBorders>
-              <w:left w:val="single" w:sz="12" w:color="8FB2C8"/>
-            </w:tcBorders>
-          </w:tcPr>
-          <w:p>
-            <w:pPr>
-              <w:spacing w:after="0"/>
-            </w:pPr>
-            <w:r>
-              <w:rPr>
-                <w:rFonts w:ascii="Arial" w:hAnsi="Arial"/>
-                <w:color w:val="4C5661"/>
-                <w:sz w:val="19"/>
-              </w:rPr>
-              <w:t>Speed Solutions Prestação de Serviços Ltda. • Embu das Artes/SP</w:t>
-            </w:r>
-          </w:p>
-        </w:tc>
-      </w:tr>
-    </w:tbl>
-    <w:p>
-      <w:pPr>
-        <w:spacing w:after="0"/>
-      </w:pPr>
-    </w:p>
-    <w:tbl>
-      <w:tblPr>
-        <w:tblW w:type="auto" w:w="0"/>
-        <w:tblLayout w:type="fixed"/>
-        <w:tblLook w:firstColumn="1" w:firstRow="1" w:lastColumn="0" w:lastRow="0" w:noHBand="0" w:noVBand="1" w:val="04A0"/>
-      </w:tblPr>
-      <w:tblGrid>
-        <w:gridCol w:w="6236"/>
-        <w:gridCol w:w="3118"/>
-      </w:tblGrid>
-      <w:tr>
-        <w:tc>
-          <w:tcPr>
-            <w:tcW w:type="dxa" w:w="4819"/>
-            <w:tcBorders>
-              <w:left w:val="single" w:sz="12" w:color="8FB2C8"/>
-            </w:tcBorders>
-          </w:tcPr>
-          <w:p>
-            <w:pPr>
-              <w:spacing w:after="0"/>
-            </w:pPr>
-            <w:r>
-              <w:rPr>
-                <w:rFonts w:ascii="Arial" w:hAnsi="Arial"/>
-                <w:b/>
-                <w:color w:val="36414C"/>
-                <w:sz w:val="22"/>
-              </w:rPr>
-              <w:t>Cronoanalista</w:t>
-            </w:r>
-          </w:p>
-        </w:tc>
-        <w:tc>
-          <w:tcPr>
-            <w:tcW w:type="dxa" w:w="4819"/>
-          </w:tcPr>
-          <w:p>
-            <w:pPr>
-              <w:spacing w:after="0"/>
-              <w:jc w:val="right"/>
-            </w:pPr>
-            <w:r>
-              <w:rPr>
-                <w:rFonts w:ascii="Arial" w:hAnsi="Arial"/>
-                <w:b/>
-                <w:color w:val="3F718F"/>
-                <w:sz w:val="18"/>
-              </w:rPr>
-              <w:t>out/2013 — out/2016</w:t>
-            </w:r>
-          </w:p>
-        </w:tc>
-      </w:tr>
-      <w:tr>
-        <w:tc>
-          <w:tcPr>
-            <w:tcW w:type="dxa" w:w="9638"/>
-            <w:gridSpan w:val="2"/>
-            <w:tcBorders>
-              <w:left w:val="single" w:sz="12" w:color="8FB2C8"/>
-            </w:tcBorders>
-          </w:tcPr>
-          <w:p>
-            <w:pPr>
-              <w:spacing w:after="0"/>
-            </w:pPr>
-            <w:r>
-              <w:rPr>
-                <w:rFonts w:ascii="Arial" w:hAnsi="Arial"/>
-                <w:color w:val="4C5661"/>
-                <w:sz w:val="19"/>
-              </w:rPr>
-              <w:t>P. Pires Serviços Ltda. • São Paulo/SP</w:t>
-            </w:r>
-          </w:p>
-        </w:tc>
-      </w:tr>
-    </w:tbl>
-    <w:p>
-      <w:pPr>
-        <w:spacing w:after="0"/>
-      </w:pPr>
-    </w:p>
-    <w:tbl>
-      <w:tblPr>
-        <w:tblW w:type="auto" w:w="0"/>
-        <w:tblLayout w:type="fixed"/>
-        <w:tblLook w:firstColumn="1" w:firstRow="1" w:lastColumn="0" w:lastRow="0" w:noHBand="0" w:noVBand="1" w:val="04A0"/>
-      </w:tblPr>
-      <w:tblGrid>
-        <w:gridCol w:w="3231"/>
-        <w:gridCol w:w="6123"/>
-      </w:tblGrid>
-      <w:tr>
-        <w:trPr>
-          <w:trHeight w:val="369"/>
-        </w:trPr>
-        <w:tc>
-          <w:tcPr>
-            <w:tcW w:type="dxa" w:w="4819"/>
-            <w:vAlign w:val="center"/>
-          </w:tcPr>
-          <w:p>
-            <w:pPr>
-              <w:spacing w:after="0"/>
-            </w:pPr>
-            <w:r>
-              <w:rPr>
-                <w:rFonts w:ascii="Arial" w:hAnsi="Arial"/>
-                <w:b/>
-                <w:color w:val="174F78"/>
-                <w:sz w:val="22"/>
-              </w:rPr>
-              <w:t>COMPETÊNCIAS</w:t>
-            </w:r>
-          </w:p>
-        </w:tc>
-        <w:tc>
-          <w:tcPr>
-            <w:tcW w:type="dxa" w:w="4819"/>
-            <w:vAlign w:val="center"/>
-            <w:tcBorders>
-              <w:top w:val="single" w:sz="5" w:color="C8D3DC"/>
-            </w:tcBorders>
-          </w:tcPr>
-          <w:p>
-            <w:pPr>
-              <w:spacing w:after="0" w:before="100"/>
-            </w:pPr>
-          </w:p>
-        </w:tc>
-      </w:tr>
-    </w:tbl>
-    <w:tbl>
-      <w:tblPr>
-        <w:tblW w:type="auto" w:w="0"/>
-        <w:tblLayout w:type="fixed"/>
-        <w:tblLook w:firstColumn="1" w:firstRow="1" w:lastColumn="0" w:lastRow="0" w:noHBand="0" w:noVBand="1" w:val="04A0"/>
-      </w:tblPr>
-      <w:tblGrid>
-        <w:gridCol w:w="4677"/>
-        <w:gridCol w:w="4677"/>
-      </w:tblGrid>
-      <w:tr>
-        <w:tc>
-          <w:tcPr>
-            <w:tcW w:type="dxa" w:w="4819"/>
-          </w:tcPr>
-          <w:p>
-            <w:pPr>
-              <w:spacing w:after="40"/>
-            </w:pPr>
-            <w:r>
-              <w:rPr>
-                <w:rFonts w:ascii="Arial" w:hAnsi="Arial"/>
-                <w:color w:val="36414C"/>
-                <w:sz w:val="19"/>
-              </w:rPr>
-              <w:t>✓  Organização e responsabilidade</w:t>
-            </w:r>
-          </w:p>
-        </w:tc>
-        <w:tc>
-          <w:tcPr>
-            <w:tcW w:type="dxa" w:w="4819"/>
-          </w:tcPr>
-          <w:p>
-            <w:pPr>
-              <w:spacing w:after="40"/>
-            </w:pPr>
-            <w:r>
-              <w:rPr>
-                <w:rFonts w:ascii="Arial" w:hAnsi="Arial"/>
-                <w:color w:val="36414C"/>
-                <w:sz w:val="19"/>
-              </w:rPr>
-              <w:t>✓  Atenção a normas e procedimentos</w:t>
-            </w:r>
-          </w:p>
-        </w:tc>
-      </w:tr>
-      <w:tr>
-        <w:tc>
-          <w:tcPr>
-            <w:tcW w:type="dxa" w:w="4819"/>
-          </w:tcPr>
-          <w:p>
-            <w:pPr>
-              <w:spacing w:after="40"/>
-            </w:pPr>
-            <w:r>
-              <w:rPr>
-                <w:rFonts w:ascii="Arial" w:hAnsi="Arial"/>
-                <w:color w:val="36414C"/>
-                <w:sz w:val="19"/>
-              </w:rPr>
-              <w:t>✓  Pontualidade e comprometimento</w:t>
-            </w:r>
-          </w:p>
-        </w:tc>
-        <w:tc>
-          <w:tcPr>
-            <w:tcW w:type="dxa" w:w="4819"/>
-          </w:tcPr>
-          <w:p>
-            <w:pPr>
-              <w:spacing w:after="40"/>
-            </w:pPr>
-            <w:r>
-              <w:rPr>
-                <w:rFonts w:ascii="Arial" w:hAnsi="Arial"/>
-                <w:color w:val="36414C"/>
-                <w:sz w:val="19"/>
-              </w:rPr>
-              <w:t>✓  Trabalho em equipe</w:t>
-            </w:r>
-          </w:p>
-        </w:tc>
-      </w:tr>
-      <w:tr>
-        <w:tc>
-          <w:tcPr>
-            <w:tcW w:type="dxa" w:w="4819"/>
-          </w:tcPr>
-          <w:p>
-            <w:pPr>
-              <w:spacing w:after="40"/>
-            </w:pPr>
-            <w:r>
-              <w:rPr>
-                <w:rFonts w:ascii="Arial" w:hAnsi="Arial"/>
-                <w:color w:val="36414C"/>
-                <w:sz w:val="19"/>
-              </w:rPr>
-              <w:t>✓  Acompanhamento de rotinas</w:t>
-            </w:r>
-          </w:p>
-        </w:tc>
-        <w:tc>
-          <w:tcPr>
-            <w:tcW w:type="dxa" w:w="4819"/>
-          </w:tcPr>
-          <w:p>
-            <w:pPr>
-              <w:spacing w:after="40"/>
-            </w:pPr>
-            <w:r>
-              <w:rPr>
-                <w:rFonts w:ascii="Arial" w:hAnsi="Arial"/>
-                <w:color w:val="36414C"/>
-                <w:sz w:val="19"/>
-              </w:rPr>
-              <w:t>✓  Disposição para aprender</w:t>
-            </w:r>
-          </w:p>
-        </w:tc>
-      </w:tr>
-    </w:tbl>
     <w:sectPr>
       <w:pgSz w:w="11906" w:h="16838"/>
-      <w:pgMar w:top="992" w:right="1134" w:bottom="935" w:left="1134" w:header="720" w:footer="720" w:gutter="0"/>
+      <w:pgMar w:top="0" w:right="0" w:bottom="0" w:left="0" w:header="0" w:footer="0" w:gutter="0"/>
       <w:cols w:space="720"/>
       <w:docGrid w:linePitch="360"/>
     </w:sectPr>
@@ -961,13 +415,6 @@
     <w:name w:val="Normal"/>
     <w:qFormat/>
     <w:rsid w:val="00FC693F"/>
-    <w:pPr>
-      <w:spacing w:after="0"/>
-    </w:pPr>
-    <w:rPr>
-      <w:rFonts w:ascii="Arial" w:hAnsi="Arial"/>
-      <w:sz w:val="20"/>
-    </w:rPr>
   </w:style>
   <w:style w:type="paragraph" w:styleId="Header">
     <w:name w:val="header"/>

</xml_diff>